<commit_message>
Harder medium and hard questions with typed values (Set Value block, formats, chart titles)
Co-Authored-By: Claude Sonnet 5.5 <noreply@anthropic.com>
</commit_message>
<xml_diff>
--- a/PYLOOM_Mapping_Solutions_Images_v2.docx
+++ b/PYLOOM_Mapping_Solutions_Images_v2.docx
@@ -23,7 +23,7 @@
         <w:t xml:space="preserve">Colours: </w:t>
       </w:r>
       <w:r>
-        <w:t>Blue = Input / Output / Get   Green = Compare   Orange = Search &amp; Sort / Text   Pink = Charts &amp; Grades   Purple = Math</w:t>
+        <w:t>Blue = Input / Output / Get   Green = Compare / If-Else / Filter   Orange = Search &amp; Sort / Text   Pink = Charts &amp; Grades   Purple = Math</w:t>
       </w:r>
     </w:p>
     <w:p>
@@ -84,7 +84,7 @@
       <w:r>
         <w:drawing>
           <wp:inline xmlns:a="http://schemas.openxmlformats.org/drawingml/2006/main" xmlns:pic="http://schemas.openxmlformats.org/drawingml/2006/picture">
-            <wp:extent cx="5760720" cy="2478035"/>
+            <wp:extent cx="5760720" cy="2071003"/>
             <wp:docPr id="1" name="Picture 1"/>
             <wp:cNvGraphicFramePr>
               <a:graphicFrameLocks noChangeAspect="1"/>
@@ -105,7 +105,7 @@
                   <pic:spPr>
                     <a:xfrm>
                       <a:off x="0" y="0"/>
-                      <a:ext cx="5760720" cy="2478035"/>
+                      <a:ext cx="5760720" cy="2071003"/>
                     </a:xfrm>
                     <a:prstGeom prst="rect"/>
                   </pic:spPr>
@@ -206,7 +206,7 @@
       <w:r>
         <w:drawing>
           <wp:inline xmlns:a="http://schemas.openxmlformats.org/drawingml/2006/main" xmlns:pic="http://schemas.openxmlformats.org/drawingml/2006/picture">
-            <wp:extent cx="5760720" cy="1750839"/>
+            <wp:extent cx="5760720" cy="1460002"/>
             <wp:docPr id="2" name="Picture 2"/>
             <wp:cNvGraphicFramePr>
               <a:graphicFrameLocks noChangeAspect="1"/>
@@ -227,7 +227,7 @@
                   <pic:spPr>
                     <a:xfrm>
                       <a:off x="0" y="0"/>
-                      <a:ext cx="5760720" cy="1750839"/>
+                      <a:ext cx="5760720" cy="1460002"/>
                     </a:xfrm>
                     <a:prstGeom prst="rect"/>
                   </pic:spPr>
@@ -344,7 +344,7 @@
       <w:r>
         <w:drawing>
           <wp:inline xmlns:a="http://schemas.openxmlformats.org/drawingml/2006/main" xmlns:pic="http://schemas.openxmlformats.org/drawingml/2006/picture">
-            <wp:extent cx="5760720" cy="1866602"/>
+            <wp:extent cx="5760720" cy="1557677"/>
             <wp:docPr id="3" name="Picture 3"/>
             <wp:cNvGraphicFramePr>
               <a:graphicFrameLocks noChangeAspect="1"/>
@@ -365,7 +365,7 @@
                   <pic:spPr>
                     <a:xfrm>
                       <a:off x="0" y="0"/>
-                      <a:ext cx="5760720" cy="1866602"/>
+                      <a:ext cx="5760720" cy="1557677"/>
                     </a:xfrm>
                     <a:prstGeom prst="rect"/>
                   </pic:spPr>
@@ -482,7 +482,7 @@
       <w:r>
         <w:drawing>
           <wp:inline xmlns:a="http://schemas.openxmlformats.org/drawingml/2006/main" xmlns:pic="http://schemas.openxmlformats.org/drawingml/2006/picture">
-            <wp:extent cx="5760720" cy="2478035"/>
+            <wp:extent cx="5760720" cy="2071003"/>
             <wp:docPr id="4" name="Picture 4"/>
             <wp:cNvGraphicFramePr>
               <a:graphicFrameLocks noChangeAspect="1"/>
@@ -503,7 +503,7 @@
                   <pic:spPr>
                     <a:xfrm>
                       <a:off x="0" y="0"/>
-                      <a:ext cx="5760720" cy="2478035"/>
+                      <a:ext cx="5760720" cy="2071003"/>
                     </a:xfrm>
                     <a:prstGeom prst="rect"/>
                   </pic:spPr>
@@ -604,7 +604,7 @@
       <w:r>
         <w:drawing>
           <wp:inline xmlns:a="http://schemas.openxmlformats.org/drawingml/2006/main" xmlns:pic="http://schemas.openxmlformats.org/drawingml/2006/picture">
-            <wp:extent cx="5760720" cy="2618063"/>
+            <wp:extent cx="5760720" cy="2184819"/>
             <wp:docPr id="5" name="Picture 5"/>
             <wp:cNvGraphicFramePr>
               <a:graphicFrameLocks noChangeAspect="1"/>
@@ -625,7 +625,7 @@
                   <pic:spPr>
                     <a:xfrm>
                       <a:off x="0" y="0"/>
-                      <a:ext cx="5760720" cy="2618063"/>
+                      <a:ext cx="5760720" cy="2184819"/>
                     </a:xfrm>
                     <a:prstGeom prst="rect"/>
                   </pic:spPr>
@@ -705,12 +705,12 @@
         <w:pStyle w:val="Heading2"/>
       </w:pPr>
       <w:r>
-        <w:t>Medium 1 – Binary Search Locator</w:t>
+        <w:t>Medium 1 – Binary Search Position Finder</w:t>
       </w:r>
     </w:p>
     <w:p>
       <w:r>
-        <w:t>Given a sorted array and a target value, find the index of the target using Binary Search: look at the middle value and keep halving the search range.</w:t>
+        <w:t>Given a sorted array, find where the value 10 sits using Binary Search (look at the middle value and keep halving the range). The target is NOT in the input: you must enter it yourself. Report the position counting from 1, written as "Position: &lt;number&gt;" (0 when the value is missing).</w:t>
       </w:r>
     </w:p>
     <w:p>
@@ -721,7 +721,7 @@
         <w:t xml:space="preserve">Input data: </w:t>
       </w:r>
       <w:r>
-        <w:t>{"array": [2, 4, 6, 8, 10, 12, 14], "target": 10}</w:t>
+        <w:t>{"array": [2, 4, 6, 8, 10, 12, 14]}</w:t>
       </w:r>
     </w:p>
     <w:p>
@@ -732,7 +732,7 @@
         <w:t xml:space="preserve">Operation: </w:t>
       </w:r>
       <w:r>
-        <w:t>Binary search: Midpoint → Compare → Repeat on the half that can still contain the target</w:t>
+        <w:t>Set target = 10 → Midpoint → Compare → Repeat → add 1 (index → position) → format the answer as Position: &lt;number&gt;</w:t>
       </w:r>
     </w:p>
     <w:p>
@@ -743,14 +743,14 @@
         <w:t xml:space="preserve">Expected output: </w:t>
       </w:r>
       <w:r>
-        <w:t>4</w:t>
+        <w:t>Position: 5</w:t>
       </w:r>
     </w:p>
     <w:p>
       <w:r>
         <w:drawing>
           <wp:inline xmlns:a="http://schemas.openxmlformats.org/drawingml/2006/main" xmlns:pic="http://schemas.openxmlformats.org/drawingml/2006/picture">
-            <wp:extent cx="5760720" cy="1496068"/>
+            <wp:extent cx="5760720" cy="893772"/>
             <wp:docPr id="6" name="Picture 6"/>
             <wp:cNvGraphicFramePr>
               <a:graphicFrameLocks noChangeAspect="1"/>
@@ -771,7 +771,7 @@
                   <pic:spPr>
                     <a:xfrm>
                       <a:off x="0" y="0"/>
-                      <a:ext cx="5760720" cy="1496068"/>
+                      <a:ext cx="5760720" cy="893772"/>
                     </a:xfrm>
                     <a:prstGeom prst="rect"/>
                   </pic:spPr>
@@ -795,7 +795,7 @@
         <w:pStyle w:val="ListBullet"/>
       </w:pPr>
       <w:r>
-        <w:t>Drag an Input node and set Input Data to {"array": [2, 4, 6, 8, 10, 12, 14], "target": 10}.</w:t>
+        <w:t>Drag an Input node and set Input Data to {"array": [2, 4, 6, 8, 10, 12, 14]}. There is no target in it yet.</w:t>
       </w:r>
     </w:p>
     <w:p>
@@ -803,7 +803,7 @@
         <w:pStyle w:val="ListBullet"/>
       </w:pPr>
       <w:r>
-        <w:t>Input → Midpoint. Midpoint picks the middle index of the search range (here index 3, the value 8).</w:t>
+        <w:t>Input → Set Value. Open ⚙ and type Key = target and Value = 10. This adds the target to the data.</w:t>
       </w:r>
     </w:p>
     <w:p>
@@ -811,7 +811,7 @@
         <w:pStyle w:val="ListBullet"/>
       </w:pPr>
       <w:r>
-        <w:t>Midpoint → BinaryCompare. It compares the middle value with the target: equal = found; target smaller = search the left half; target larger = search the right half. (8 &lt; 10, so the right half is next.)</w:t>
+        <w:t>Set Value → Middle. It picks the middle index of the search range (index 3, the value 8).</w:t>
       </w:r>
     </w:p>
     <w:p>
@@ -819,7 +819,7 @@
         <w:pStyle w:val="ListBullet"/>
       </w:pPr>
       <w:r>
-        <w:t>BinaryCompare → RepeatSearch. It repeats Midpoint + Compare on the narrowed range until the target is found, and returns its index (10 is at index 4). It returns -1 when the target is not in the array.</w:t>
+        <w:t>Middle → Compare Middle. Equal = found; target smaller = search the left half; larger = search the right half.</w:t>
       </w:r>
     </w:p>
     <w:p>
@@ -827,7 +827,7 @@
         <w:pStyle w:val="ListBullet"/>
       </w:pPr>
       <w:r>
-        <w:t>RepeatSearch → Output.</w:t>
+        <w:t>Compare Middle → Repeat Search. It repeats Middle + Compare until the target is found and returns its INDEX (10 is at index 4; -1 when missing).</w:t>
       </w:r>
     </w:p>
     <w:p>
@@ -835,7 +835,23 @@
         <w:pStyle w:val="ListBullet"/>
       </w:pPr>
       <w:r>
-        <w:t>Leave the Output format empty. Run Flow must show 4 (the index of the value 10).</w:t>
+        <w:t>Repeat Search → Add. Type Operand = 1 so the index becomes a position (index 4 → position 5; a missing value gives 0).</w:t>
+      </w:r>
+    </w:p>
+    <w:p>
+      <w:pPr>
+        <w:pStyle w:val="ListBullet"/>
+      </w:pPr>
+      <w:r>
+        <w:t>Add → Output. Type the Output format: Position: {value}</w:t>
+      </w:r>
+    </w:p>
+    <w:p>
+      <w:pPr>
+        <w:pStyle w:val="ListBullet"/>
+      </w:pPr>
+      <w:r>
+        <w:t>Run Flow must show Position: 5.</w:t>
       </w:r>
     </w:p>
     <w:p>
@@ -843,12 +859,12 @@
         <w:pStyle w:val="Heading2"/>
       </w:pPr>
       <w:r>
-        <w:t>Medium 2 – Leap Year Checker</w:t>
+        <w:t>Medium 2 – Next-Year Leap Checker</w:t>
       </w:r>
     </w:p>
     <w:p>
       <w:r>
-        <w:t>Given a year, decide whether it is a leap year. A year is a leap year if it is divisible by 4, except century years (divisible by 100), which must also be divisible by 400.</w:t>
+        <w:t>Given a year, check the NEXT year (year + 1). It is a leap year if divisible by 4, except century years (divisible by 100), which must also be divisible by 400. Show the answer as "Next year: Leap Year" or "Next year: Common Year".</w:t>
       </w:r>
     </w:p>
     <w:p>
@@ -859,7 +875,7 @@
         <w:t xml:space="preserve">Input data: </w:t>
       </w:r>
       <w:r>
-        <w:t>2000</w:t>
+        <w:t>1999</w:t>
       </w:r>
     </w:p>
     <w:p>
@@ -870,7 +886,7 @@
         <w:t xml:space="preserve">Operation: </w:t>
       </w:r>
       <w:r>
-        <w:t>Divisible by 4? Then, if it is a century year, divisible by 400?</w:t>
+        <w:t>Year + 1 → divisible by 4? → century rule → if True then "Leap Year" else "Common Year" → format as Next year: &lt;answer&gt;</w:t>
       </w:r>
     </w:p>
     <w:p>
@@ -881,14 +897,14 @@
         <w:t xml:space="preserve">Expected output: </w:t>
       </w:r>
       <w:r>
-        <w:t>True</w:t>
+        <w:t>Next year: Leap Year</w:t>
       </w:r>
     </w:p>
     <w:p>
       <w:r>
         <w:drawing>
           <wp:inline xmlns:a="http://schemas.openxmlformats.org/drawingml/2006/main" xmlns:pic="http://schemas.openxmlformats.org/drawingml/2006/picture">
-            <wp:extent cx="5760720" cy="1866602"/>
+            <wp:extent cx="5760720" cy="1041960"/>
             <wp:docPr id="7" name="Picture 7"/>
             <wp:cNvGraphicFramePr>
               <a:graphicFrameLocks noChangeAspect="1"/>
@@ -909,7 +925,7 @@
                   <pic:spPr>
                     <a:xfrm>
                       <a:off x="0" y="0"/>
-                      <a:ext cx="5760720" cy="1866602"/>
+                      <a:ext cx="5760720" cy="1041960"/>
                     </a:xfrm>
                     <a:prstGeom prst="rect"/>
                   </pic:spPr>
@@ -933,7 +949,7 @@
         <w:pStyle w:val="ListBullet"/>
       </w:pPr>
       <w:r>
-        <w:t>Drag an Input node and set Input Data to 2000 (the year).</w:t>
+        <w:t>Drag an Input node and set Input Data to 1999 (the year).</w:t>
       </w:r>
     </w:p>
     <w:p>
@@ -941,7 +957,7 @@
         <w:pStyle w:val="ListBullet"/>
       </w:pPr>
       <w:r>
-        <w:t>Input → Div4Check. It checks whether the year is divisible by 4 (2000 ÷ 4 → yes).</w:t>
+        <w:t>Input → Add. Type Operand = 1 to move to the next year (1999 → 2000).</w:t>
       </w:r>
     </w:p>
     <w:p>
@@ -949,7 +965,7 @@
         <w:pStyle w:val="ListBullet"/>
       </w:pPr>
       <w:r>
-        <w:t>Div4Check → CenturyRule. If the year is a century year (divisible by 100) it must ALSO be divisible by 400 to stay a leap year (2000 ÷ 400 → yes). Years that are not centuries pass automatically.</w:t>
+        <w:t>Add → Divisible by 4. It checks whether that year is divisible by 4.</w:t>
       </w:r>
     </w:p>
     <w:p>
@@ -957,7 +973,7 @@
         <w:pStyle w:val="ListBullet"/>
       </w:pPr>
       <w:r>
-        <w:t>CenturyRule → Output.</w:t>
+        <w:t>Divisible by 4 → Century Rule. A century year must ALSO be divisible by 400 (2000 ÷ 400 → yes).</w:t>
       </w:r>
     </w:p>
     <w:p>
@@ -965,7 +981,23 @@
         <w:pStyle w:val="ListBullet"/>
       </w:pPr>
       <w:r>
-        <w:t>Leave the Output format empty. Run Flow must show True (2000 is divisible by 4, by 100 and by 400).</w:t>
+        <w:t>Century Rule → If / Else. Set Operator == , Compare with True, Then Leap Year, Otherwise Common Year.</w:t>
+      </w:r>
+    </w:p>
+    <w:p>
+      <w:pPr>
+        <w:pStyle w:val="ListBullet"/>
+      </w:pPr>
+      <w:r>
+        <w:t>If / Else → Output. Type the Output format: Next year: {value}</w:t>
+      </w:r>
+    </w:p>
+    <w:p>
+      <w:pPr>
+        <w:pStyle w:val="ListBullet"/>
+      </w:pPr>
+      <w:r>
+        <w:t>Run Flow must show Next year: Leap Year.</w:t>
       </w:r>
     </w:p>
     <w:p>
@@ -973,12 +1005,12 @@
         <w:pStyle w:val="Heading2"/>
       </w:pPr>
       <w:r>
-        <w:t>Medium 3 – Sorting a List of Numbers</w:t>
+        <w:t>Medium 3 – Valid Marks Sorter</w:t>
       </w:r>
     </w:p>
     <w:p>
       <w:r>
-        <w:t>Given an unsorted list of numbers, sort them in ascending order using Bubble Sort: repeatedly compare neighbouring numbers and swap them when the left one is greater than the right one.</w:t>
+        <w:t>A list of marks contains invalid values. Keep only marks from 10 to 100 (both included), then sort the valid marks in ascending order with Bubble Sort. Show them as "Sorted marks: [..]".</w:t>
       </w:r>
     </w:p>
     <w:p>
@@ -989,7 +1021,7 @@
         <w:t xml:space="preserve">Input data: </w:t>
       </w:r>
       <w:r>
-        <w:t>[64, 25, 12, 22, 11]</w:t>
+        <w:t>[64, 150, 25, 12, 5, 22, 11, 90]</w:t>
       </w:r>
     </w:p>
     <w:p>
@@ -1000,7 +1032,7 @@
         <w:t xml:space="preserve">Operation: </w:t>
       </w:r>
       <w:r>
-        <w:t>Bubble sort: compare &amp; swap neighbours, repeat the pass until no swaps are left</w:t>
+        <w:t>Keep marks between 10 and 100 → bubble sort (compare &amp; swap, repeat) → format as Sorted marks: &lt;list&gt;</w:t>
       </w:r>
     </w:p>
     <w:p>
@@ -1011,14 +1043,14 @@
         <w:t xml:space="preserve">Expected output: </w:t>
       </w:r>
       <w:r>
-        <w:t>[11, 12, 22, 25, 64]</w:t>
+        <w:t>Sorted marks: [11, 12, 22, 25, 64, 90]</w:t>
       </w:r>
     </w:p>
     <w:p>
       <w:r>
         <w:drawing>
           <wp:inline xmlns:a="http://schemas.openxmlformats.org/drawingml/2006/main" xmlns:pic="http://schemas.openxmlformats.org/drawingml/2006/picture">
-            <wp:extent cx="5760720" cy="1866602"/>
+            <wp:extent cx="5760720" cy="1248276"/>
             <wp:docPr id="8" name="Picture 8"/>
             <wp:cNvGraphicFramePr>
               <a:graphicFrameLocks noChangeAspect="1"/>
@@ -1039,7 +1071,7 @@
                   <pic:spPr>
                     <a:xfrm>
                       <a:off x="0" y="0"/>
-                      <a:ext cx="5760720" cy="1866602"/>
+                      <a:ext cx="5760720" cy="1248276"/>
                     </a:xfrm>
                     <a:prstGeom prst="rect"/>
                   </pic:spPr>
@@ -1063,7 +1095,7 @@
         <w:pStyle w:val="ListBullet"/>
       </w:pPr>
       <w:r>
-        <w:t>Drag an Input node and set Input Data to [64, 25, 12, 22, 11].</w:t>
+        <w:t>Drag an Input node and set Input Data to [64, 150, 25, 12, 5, 22, 11, 90].</w:t>
       </w:r>
     </w:p>
     <w:p>
@@ -1071,7 +1103,7 @@
         <w:pStyle w:val="ListBullet"/>
       </w:pPr>
       <w:r>
-        <w:t>Input → CompareSwap. It makes ONE pass over the list: each pair of neighbours is compared and swapped if the left number is greater (64 bubbles to the end: [25, 12, 22, 11, 64]).</w:t>
+        <w:t>Input → Filter. Type Min = 10 and Max = 100. The invalid marks 150 and 5 are removed: [64, 25, 12, 22, 11, 90].</w:t>
       </w:r>
     </w:p>
     <w:p>
@@ -1079,7 +1111,7 @@
         <w:pStyle w:val="ListBullet"/>
       </w:pPr>
       <w:r>
-        <w:t>CompareSwap → PassRepeat. It keeps repeating the pass until a full pass needs no swaps - then the list is sorted.</w:t>
+        <w:t>Filter → Swap Pairs. ONE pass: neighbours are compared and swapped when the left one is greater.</w:t>
       </w:r>
     </w:p>
     <w:p>
@@ -1087,7 +1119,7 @@
         <w:pStyle w:val="ListBullet"/>
       </w:pPr>
       <w:r>
-        <w:t>PassRepeat → Output.</w:t>
+        <w:t>Swap Pairs → Repeat Passes. It repeats the pass until no swaps are left: the list is sorted.</w:t>
       </w:r>
     </w:p>
     <w:p>
@@ -1095,7 +1127,15 @@
         <w:pStyle w:val="ListBullet"/>
       </w:pPr>
       <w:r>
-        <w:t>Leave the Output format empty. Run Flow must show [11, 12, 22, 25, 64].</w:t>
+        <w:t>Repeat Passes → Output. Type the Output format: Sorted marks: {value}</w:t>
+      </w:r>
+    </w:p>
+    <w:p>
+      <w:pPr>
+        <w:pStyle w:val="ListBullet"/>
+      </w:pPr>
+      <w:r>
+        <w:t>Run Flow must show Sorted marks: [11, 12, 22, 25, 64, 90].</w:t>
       </w:r>
     </w:p>
     <w:p>
@@ -1111,12 +1151,12 @@
         <w:pStyle w:val="Heading2"/>
       </w:pPr>
       <w:r>
-        <w:t>Hard 1 – Monthly Expense Pie Chart</w:t>
+        <w:t>Hard 1 – Monthly Budget Pie Chart</w:t>
       </w:r>
     </w:p>
     <w:p>
       <w:r>
-        <w:t>A personal finance app records monthly expenses in 4 categories: Rent, Food, Transport and Entertainment. Calculate each category's percentage share of the total spending, then draw the result as a pie chart.</w:t>
+        <w:t>A finance app records monthly expenses in 4 categories. The person also puts 6000 into Savings, but Savings is not in the data: add it yourself as a 5th category. Calculate every category's percentage share of the total, then draw a pie chart titled "Monthly Budget Pie Chart" (type the title yourself).</w:t>
       </w:r>
     </w:p>
     <w:p>
@@ -1138,7 +1178,7 @@
         <w:t xml:space="preserve">Operation: </w:t>
       </w:r>
       <w:r>
-        <w:t>Total = sum of all amounts; percentage = amount ÷ total × 100; draw a pie chart</w:t>
+        <w:t>Add Savings = 6000 → total = sum of all amounts → percentage = amount ÷ total × 100 → pie chart with the title typed in</w:t>
       </w:r>
     </w:p>
     <w:p>
@@ -1149,14 +1189,14 @@
         <w:t xml:space="preserve">Expected output: </w:t>
       </w:r>
       <w:r>
-        <w:t>Rent: 50% | Food: 25% | Transport: 12.5% | Entertainment: 12.5%</w:t>
+        <w:t>Rent: 40% | Food: 20% | Transport: 10% | Entertainment: 10% | Savings: 20%</w:t>
       </w:r>
     </w:p>
     <w:p>
       <w:r>
         <w:drawing>
           <wp:inline xmlns:a="http://schemas.openxmlformats.org/drawingml/2006/main" xmlns:pic="http://schemas.openxmlformats.org/drawingml/2006/picture">
-            <wp:extent cx="5760720" cy="1496068"/>
+            <wp:extent cx="5760720" cy="1041960"/>
             <wp:docPr id="9" name="Picture 9"/>
             <wp:cNvGraphicFramePr>
               <a:graphicFrameLocks noChangeAspect="1"/>
@@ -1177,7 +1217,7 @@
                   <pic:spPr>
                     <a:xfrm>
                       <a:off x="0" y="0"/>
-                      <a:ext cx="5760720" cy="1496068"/>
+                      <a:ext cx="5760720" cy="1041960"/>
                     </a:xfrm>
                     <a:prstGeom prst="rect"/>
                   </pic:spPr>
@@ -1209,7 +1249,7 @@
         <w:pStyle w:val="ListBullet"/>
       </w:pPr>
       <w:r>
-        <w:t>Input → TotalSum. It adds up every category (total = 24000) and passes the amounts on.</w:t>
+        <w:t>Input → Set Value. Type Key = Savings and Value = 6000. Savings becomes the 5th category.</w:t>
       </w:r>
     </w:p>
     <w:p>
@@ -1217,7 +1257,7 @@
         <w:pStyle w:val="ListBullet"/>
       </w:pPr>
       <w:r>
-        <w:t>TotalSum → Percentage. For every category it does amount ÷ total × 100 (Rent: 12000 ÷ 24000 × 100 = 50%).</w:t>
+        <w:t>Set Value → Total Amount. It adds up all 5 categories (total = 30000).</w:t>
       </w:r>
     </w:p>
     <w:p>
@@ -1225,7 +1265,7 @@
         <w:pStyle w:val="ListBullet"/>
       </w:pPr>
       <w:r>
-        <w:t>Percentage → PieChart. It draws one slice per category (the chart title is already filled in).</w:t>
+        <w:t>Total Amount → Percent. For each category: amount ÷ total × 100 (Rent: 12000 ÷ 30000 × 100 = 40%).</w:t>
       </w:r>
     </w:p>
     <w:p>
@@ -1233,7 +1273,7 @@
         <w:pStyle w:val="ListBullet"/>
       </w:pPr>
       <w:r>
-        <w:t>PieChart → Output.</w:t>
+        <w:t>Percent → Pie Chart. Type the Title: Monthly Budget Pie Chart.</w:t>
       </w:r>
     </w:p>
     <w:p>
@@ -1241,7 +1281,15 @@
         <w:pStyle w:val="ListBullet"/>
       </w:pPr>
       <w:r>
-        <w:t>Leave the Output format empty. Run Flow must draw the pie chart and show Rent: 50% | Food: 25% | Transport: 12.5% | Entertainment: 12.5%. The reference picture shows how the chart should look.</w:t>
+        <w:t>Pie Chart → Output.</w:t>
+      </w:r>
+    </w:p>
+    <w:p>
+      <w:pPr>
+        <w:pStyle w:val="ListBullet"/>
+      </w:pPr>
+      <w:r>
+        <w:t>Leave the Output format empty. Run Flow must draw the pie chart and show Rent: 40% | Food: 20% | Transport: 10% | Entertainment: 10% | Savings: 20%.</w:t>
       </w:r>
     </w:p>
     <w:p>
@@ -1254,7 +1302,7 @@
     </w:p>
     <w:p>
       <w:r>
-        <w:t>A store tracks daily sales for 5 days against a fixed sales target of $200. Mark each day as "Above Target" (sales ≥ target) or "Below Target", then draw the results as a bar chart (green = Above, red = Below).</w:t>
+        <w:t>A store tracks daily sales for 7 days (Mon-Sun). The sales target is $200 but it is NOT in the data: enter it yourself. Mark each day "Above Target" (sales ≥ target) or "Below Target", then draw a bar chart titled "Weekly Sales Bar Chart" with the Y label "Sales ($)" (green = Above, red = Below).</w:t>
       </w:r>
     </w:p>
     <w:p>
@@ -1265,7 +1313,7 @@
         <w:t xml:space="preserve">Input data: </w:t>
       </w:r>
       <w:r>
-        <w:t>{"sales": [180, 220, 250, 150, 300], "target": 200}</w:t>
+        <w:t>{"sales": [180, 220, 250, 150, 300, 170, 260]}</w:t>
       </w:r>
     </w:p>
     <w:p>
@@ -1276,7 +1324,7 @@
         <w:t xml:space="preserve">Operation: </w:t>
       </w:r>
       <w:r>
-        <w:t>For each day: sales ≥ target → Above Target, otherwise Below Target; draw a bar chart</w:t>
+        <w:t>Set target = 200 → each day: sales ≥ target → Above Target, otherwise Below Target → bar chart with the title and Y label typed in</w:t>
       </w:r>
     </w:p>
     <w:p>
@@ -1287,14 +1335,14 @@
         <w:t xml:space="preserve">Expected output: </w:t>
       </w:r>
       <w:r>
-        <w:t>Mon: Below Target | Tue: Above Target | Wed: Above Target | Thu: Below Target | Fri: Above Target</w:t>
+        <w:t>Mon: Below Target | Tue: Above Target | Wed: Above Target | Thu: Below Target | Fri: Above Target | Sat: Below Target | Sun: Above Target</w:t>
       </w:r>
     </w:p>
     <w:p>
       <w:r>
         <w:drawing>
           <wp:inline xmlns:a="http://schemas.openxmlformats.org/drawingml/2006/main" xmlns:pic="http://schemas.openxmlformats.org/drawingml/2006/picture">
-            <wp:extent cx="5760720" cy="1866602"/>
+            <wp:extent cx="5760720" cy="1248276"/>
             <wp:docPr id="10" name="Picture 10"/>
             <wp:cNvGraphicFramePr>
               <a:graphicFrameLocks noChangeAspect="1"/>
@@ -1315,7 +1363,7 @@
                   <pic:spPr>
                     <a:xfrm>
                       <a:off x="0" y="0"/>
-                      <a:ext cx="5760720" cy="1866602"/>
+                      <a:ext cx="5760720" cy="1248276"/>
                     </a:xfrm>
                     <a:prstGeom prst="rect"/>
                   </pic:spPr>
@@ -1339,7 +1387,7 @@
         <w:pStyle w:val="ListBullet"/>
       </w:pPr>
       <w:r>
-        <w:t>Drag an Input node and set Input Data to {"sales": [180, 220, 250, 150, 300], "target": 200}. The days Mon-Fri are added automatically in order.</w:t>
+        <w:t>Drag an Input node and set Input Data to {"sales": [180, 220, 250, 150, 300, 170, 260]}. The days Mon-Sun are added automatically in order.</w:t>
       </w:r>
     </w:p>
     <w:p>
@@ -1347,7 +1395,7 @@
         <w:pStyle w:val="ListBullet"/>
       </w:pPr>
       <w:r>
-        <w:t>Input → TargetCompare. For each day it checks sales ≥ target (180 → Below, 220 → Above, 250 → Above, 150 → Below, 300 → Above).</w:t>
+        <w:t>Input → Set Value. Type Key = target and Value = 200.</w:t>
       </w:r>
     </w:p>
     <w:p>
@@ -1355,7 +1403,7 @@
         <w:pStyle w:val="ListBullet"/>
       </w:pPr>
       <w:r>
-        <w:t>TargetCompare → BarChart. It draws one bar per day: green for Above Target, red for Below Target (the chart title is already filled in).</w:t>
+        <w:t>Set Value → Above / Below. For each day it checks sales ≥ target (180 → Below, 220 → Above, ...).</w:t>
       </w:r>
     </w:p>
     <w:p>
@@ -1363,7 +1411,7 @@
         <w:pStyle w:val="ListBullet"/>
       </w:pPr>
       <w:r>
-        <w:t>BarChart → Output.</w:t>
+        <w:t>Above / Below → Bar Chart. Type Title = Weekly Sales Bar Chart and Y label = Sales ($). Bars are green for Above Target, red for Below Target.</w:t>
       </w:r>
     </w:p>
     <w:p>
@@ -1371,7 +1419,15 @@
         <w:pStyle w:val="ListBullet"/>
       </w:pPr>
       <w:r>
-        <w:t>Leave the Output format empty. Run Flow must draw the bar chart and show Mon: Below Target | Tue: Above Target | Wed: Above Target | Thu: Below Target | Fri: Above Target.</w:t>
+        <w:t>Bar Chart → Output.</w:t>
+      </w:r>
+    </w:p>
+    <w:p>
+      <w:pPr>
+        <w:pStyle w:val="ListBullet"/>
+      </w:pPr>
+      <w:r>
+        <w:t>Leave the Output format empty. Run Flow must draw the bar chart and show Mon: Below Target | Tue: Above Target | Wed: Above Target | Thu: Below Target | Fri: Above Target | Sat: Below Target | Sun: Above Target.</w:t>
       </w:r>
     </w:p>
     <w:sectPr>

</xml_diff>

<commit_message>
Update mapping solutions doc (operation as Python/structured) and add image-only doc
Co-Authored-By: Claude Sonnet 5.5 <noreply@anthropic.com>
</commit_message>
<xml_diff>
--- a/PYLOOM_Mapping_Solutions_Images_v2.docx
+++ b/PYLOOM_Mapping_Solutions_Images_v2.docx
@@ -59,14 +59,45 @@
       </w:r>
     </w:p>
     <w:p>
+      <w:pPr>
+        <w:keepNext/>
+        <w:spacing w:after="40"/>
+      </w:pPr>
       <w:r>
         <w:rPr>
           <w:b/>
         </w:rPr>
-        <w:t xml:space="preserve">Operation: </w:t>
+        <w:t xml:space="preserve">Operation (Python code):</w:t>
       </w:r>
+    </w:p>
+    <w:p>
+      <w:pPr>
+        <w:keepLines/>
+        <w:shd w:val="clear" w:color="auto" w:fill="F2F2F2"/>
+        <w:spacing w:before="0" w:after="0" w:line="240" w:lineRule="auto"/>
+        <w:ind w:left="240"/>
+      </w:pPr>
       <w:r>
-        <w:t>Compare the age with the voting age limit: age &gt;= 18</w:t>
+        <w:rPr>
+          <w:rFonts w:ascii="Consolas" w:hAnsi="Consolas" w:cs="Consolas"/>
+          <w:sz w:val="19"/>
+        </w:rPr>
+        <w:t xml:space="preserve">eligible = age &gt;= 18</w:t>
+      </w:r>
+    </w:p>
+    <w:p>
+      <w:pPr>
+        <w:keepLines/>
+        <w:shd w:val="clear" w:color="auto" w:fill="F2F2F2"/>
+        <w:spacing w:before="0" w:after="120" w:line="240" w:lineRule="auto"/>
+        <w:ind w:left="240"/>
+      </w:pPr>
+      <w:r>
+        <w:rPr>
+          <w:rFonts w:ascii="Consolas" w:hAnsi="Consolas" w:cs="Consolas"/>
+          <w:sz w:val="19"/>
+        </w:rPr>
+        <w:t xml:space="preserve">print(eligible)</w:t>
       </w:r>
     </w:p>
     <w:p>
@@ -181,14 +212,45 @@
       </w:r>
     </w:p>
     <w:p>
+      <w:pPr>
+        <w:keepNext/>
+        <w:spacing w:after="40"/>
+      </w:pPr>
       <w:r>
         <w:rPr>
           <w:b/>
         </w:rPr>
-        <w:t xml:space="preserve">Operation: </w:t>
+        <w:t xml:space="preserve">Operation (Python code):</w:t>
       </w:r>
+    </w:p>
+    <w:p>
+      <w:pPr>
+        <w:keepLines/>
+        <w:shd w:val="clear" w:color="auto" w:fill="F2F2F2"/>
+        <w:spacing w:before="0" w:after="0" w:line="240" w:lineRule="auto"/>
+        <w:ind w:left="240"/>
+      </w:pPr>
       <w:r>
-        <w:t>BMI = weight / height²  (round to 1 decimal)</w:t>
+        <w:rPr>
+          <w:rFonts w:ascii="Consolas" w:hAnsi="Consolas" w:cs="Consolas"/>
+          <w:sz w:val="19"/>
+        </w:rPr>
+        <w:t xml:space="preserve">bmi = weight / (height ** 2)</w:t>
+      </w:r>
+    </w:p>
+    <w:p>
+      <w:pPr>
+        <w:keepLines/>
+        <w:shd w:val="clear" w:color="auto" w:fill="F2F2F2"/>
+        <w:spacing w:before="0" w:after="120" w:line="240" w:lineRule="auto"/>
+        <w:ind w:left="240"/>
+      </w:pPr>
+      <w:r>
+        <w:rPr>
+          <w:rFonts w:ascii="Consolas" w:hAnsi="Consolas" w:cs="Consolas"/>
+          <w:sz w:val="19"/>
+        </w:rPr>
+        <w:t xml:space="preserve">print(round(bmi, 1))</w:t>
       </w:r>
     </w:p>
     <w:p>
@@ -319,14 +381,30 @@
       </w:r>
     </w:p>
     <w:p>
+      <w:pPr>
+        <w:keepNext/>
+        <w:spacing w:after="40"/>
+      </w:pPr>
       <w:r>
         <w:rPr>
           <w:b/>
         </w:rPr>
-        <w:t xml:space="preserve">Operation: </w:t>
+        <w:t xml:space="preserve">Operation (Python code):</w:t>
       </w:r>
+    </w:p>
+    <w:p>
+      <w:pPr>
+        <w:keepLines/>
+        <w:shd w:val="clear" w:color="auto" w:fill="F2F2F2"/>
+        <w:spacing w:before="0" w:after="120" w:line="240" w:lineRule="auto"/>
+        <w:ind w:left="240"/>
+      </w:pPr>
       <w:r>
-        <w:t>Check if the word is equal to its reverse</w:t>
+        <w:rPr>
+          <w:rFonts w:ascii="Consolas" w:hAnsi="Consolas" w:cs="Consolas"/>
+          <w:sz w:val="19"/>
+        </w:rPr>
+        <w:t xml:space="preserve">print(word == word[::-1])</w:t>
       </w:r>
     </w:p>
     <w:p>
@@ -457,14 +535,45 @@
       </w:r>
     </w:p>
     <w:p>
+      <w:pPr>
+        <w:keepNext/>
+        <w:spacing w:after="40"/>
+      </w:pPr>
       <w:r>
         <w:rPr>
           <w:b/>
         </w:rPr>
-        <w:t xml:space="preserve">Operation: </w:t>
+        <w:t xml:space="preserve">Operation (Python code):</w:t>
       </w:r>
+    </w:p>
+    <w:p>
+      <w:pPr>
+        <w:keepLines/>
+        <w:shd w:val="clear" w:color="auto" w:fill="F2F2F2"/>
+        <w:spacing w:before="0" w:after="0" w:line="240" w:lineRule="auto"/>
+        <w:ind w:left="240"/>
+      </w:pPr>
       <w:r>
-        <w:t>C = (F - 32) × 5 / 9</w:t>
+        <w:rPr>
+          <w:rFonts w:ascii="Consolas" w:hAnsi="Consolas" w:cs="Consolas"/>
+          <w:sz w:val="19"/>
+        </w:rPr>
+        <w:t xml:space="preserve">celsius = (f - 32) * 5 / 9</w:t>
+      </w:r>
+    </w:p>
+    <w:p>
+      <w:pPr>
+        <w:keepLines/>
+        <w:shd w:val="clear" w:color="auto" w:fill="F2F2F2"/>
+        <w:spacing w:before="0" w:after="120" w:line="240" w:lineRule="auto"/>
+        <w:ind w:left="240"/>
+      </w:pPr>
+      <w:r>
+        <w:rPr>
+          <w:rFonts w:ascii="Consolas" w:hAnsi="Consolas" w:cs="Consolas"/>
+          <w:sz w:val="19"/>
+        </w:rPr>
+        <w:t xml:space="preserve">print(celsius)</w:t>
       </w:r>
     </w:p>
     <w:p>
@@ -579,14 +688,45 @@
       </w:r>
     </w:p>
     <w:p>
+      <w:pPr>
+        <w:keepNext/>
+        <w:spacing w:after="40"/>
+      </w:pPr>
       <w:r>
         <w:rPr>
           <w:b/>
         </w:rPr>
-        <w:t xml:space="preserve">Operation: </w:t>
+        <w:t xml:space="preserve">Operation (Python code):</w:t>
       </w:r>
+    </w:p>
+    <w:p>
+      <w:pPr>
+        <w:keepLines/>
+        <w:shd w:val="clear" w:color="auto" w:fill="F2F2F2"/>
+        <w:spacing w:before="0" w:after="0" w:line="240" w:lineRule="auto"/>
+        <w:ind w:left="240"/>
+      </w:pPr>
       <w:r>
-        <w:t>Average = sum ÷ count</w:t>
+        <w:rPr>
+          <w:rFonts w:ascii="Consolas" w:hAnsi="Consolas" w:cs="Consolas"/>
+          <w:sz w:val="19"/>
+        </w:rPr>
+        <w:t xml:space="preserve">average = sum(numbers) / len(numbers)</w:t>
+      </w:r>
+    </w:p>
+    <w:p>
+      <w:pPr>
+        <w:keepLines/>
+        <w:shd w:val="clear" w:color="auto" w:fill="F2F2F2"/>
+        <w:spacing w:before="0" w:after="120" w:line="240" w:lineRule="auto"/>
+        <w:ind w:left="240"/>
+      </w:pPr>
+      <w:r>
+        <w:rPr>
+          <w:rFonts w:ascii="Consolas" w:hAnsi="Consolas" w:cs="Consolas"/>
+          <w:sz w:val="19"/>
+        </w:rPr>
+        <w:t xml:space="preserve">print(average)</w:t>
       </w:r>
     </w:p>
     <w:p>
@@ -725,14 +865,210 @@
       </w:r>
     </w:p>
     <w:p>
+      <w:pPr>
+        <w:keepNext/>
+        <w:spacing w:after="40"/>
+      </w:pPr>
       <w:r>
         <w:rPr>
           <w:b/>
         </w:rPr>
-        <w:t xml:space="preserve">Operation: </w:t>
+        <w:t xml:space="preserve">Operation (Python code):</w:t>
       </w:r>
+    </w:p>
+    <w:p>
+      <w:pPr>
+        <w:keepLines/>
+        <w:shd w:val="clear" w:color="auto" w:fill="F2F2F2"/>
+        <w:spacing w:before="0" w:after="0" w:line="240" w:lineRule="auto"/>
+        <w:ind w:left="240"/>
+      </w:pPr>
       <w:r>
-        <w:t>Set target = 10 → Midpoint → Compare → Repeat → add 1 (index → position) → format the answer as Position: &lt;number&gt;</w:t>
+        <w:rPr>
+          <w:rFonts w:ascii="Consolas" w:hAnsi="Consolas" w:cs="Consolas"/>
+          <w:sz w:val="19"/>
+        </w:rPr>
+        <w:t xml:space="preserve">array = [2, 4, 6, 8, 10, 12, 14]</w:t>
+      </w:r>
+    </w:p>
+    <w:p>
+      <w:pPr>
+        <w:keepLines/>
+        <w:shd w:val="clear" w:color="auto" w:fill="F2F2F2"/>
+        <w:spacing w:before="0" w:after="0" w:line="240" w:lineRule="auto"/>
+        <w:ind w:left="240"/>
+      </w:pPr>
+      <w:r>
+        <w:rPr>
+          <w:rFonts w:ascii="Consolas" w:hAnsi="Consolas" w:cs="Consolas"/>
+          <w:sz w:val="19"/>
+        </w:rPr>
+        <w:t xml:space="preserve">target = 10   # not in the input: type it yourself</w:t>
+      </w:r>
+    </w:p>
+    <w:p>
+      <w:pPr>
+        <w:keepLines/>
+        <w:shd w:val="clear" w:color="auto" w:fill="F2F2F2"/>
+        <w:spacing w:before="0" w:after="0" w:line="240" w:lineRule="auto"/>
+        <w:ind w:left="240"/>
+      </w:pPr>
+      <w:r>
+        <w:rPr>
+          <w:rFonts w:ascii="Consolas" w:hAnsi="Consolas" w:cs="Consolas"/>
+          <w:sz w:val="19"/>
+        </w:rPr>
+        <w:t xml:space="preserve">index, low, high = -1, 0, len(array) - 1</w:t>
+      </w:r>
+    </w:p>
+    <w:p>
+      <w:pPr>
+        <w:keepLines/>
+        <w:shd w:val="clear" w:color="auto" w:fill="F2F2F2"/>
+        <w:spacing w:before="0" w:after="0" w:line="240" w:lineRule="auto"/>
+        <w:ind w:left="240"/>
+      </w:pPr>
+      <w:r>
+        <w:rPr>
+          <w:rFonts w:ascii="Consolas" w:hAnsi="Consolas" w:cs="Consolas"/>
+          <w:sz w:val="19"/>
+        </w:rPr>
+        <w:t xml:space="preserve">while low &lt;= high:</w:t>
+      </w:r>
+    </w:p>
+    <w:p>
+      <w:pPr>
+        <w:keepLines/>
+        <w:shd w:val="clear" w:color="auto" w:fill="F2F2F2"/>
+        <w:spacing w:before="0" w:after="0" w:line="240" w:lineRule="auto"/>
+        <w:ind w:left="240"/>
+      </w:pPr>
+      <w:r>
+        <w:rPr>
+          <w:rFonts w:ascii="Consolas" w:hAnsi="Consolas" w:cs="Consolas"/>
+          <w:sz w:val="19"/>
+        </w:rPr>
+        <w:t xml:space="preserve">    mid = (low + high) // 2</w:t>
+      </w:r>
+    </w:p>
+    <w:p>
+      <w:pPr>
+        <w:keepLines/>
+        <w:shd w:val="clear" w:color="auto" w:fill="F2F2F2"/>
+        <w:spacing w:before="0" w:after="0" w:line="240" w:lineRule="auto"/>
+        <w:ind w:left="240"/>
+      </w:pPr>
+      <w:r>
+        <w:rPr>
+          <w:rFonts w:ascii="Consolas" w:hAnsi="Consolas" w:cs="Consolas"/>
+          <w:sz w:val="19"/>
+        </w:rPr>
+        <w:t xml:space="preserve">    if array[mid] == target:</w:t>
+      </w:r>
+    </w:p>
+    <w:p>
+      <w:pPr>
+        <w:keepLines/>
+        <w:shd w:val="clear" w:color="auto" w:fill="F2F2F2"/>
+        <w:spacing w:before="0" w:after="0" w:line="240" w:lineRule="auto"/>
+        <w:ind w:left="240"/>
+      </w:pPr>
+      <w:r>
+        <w:rPr>
+          <w:rFonts w:ascii="Consolas" w:hAnsi="Consolas" w:cs="Consolas"/>
+          <w:sz w:val="19"/>
+        </w:rPr>
+        <w:t xml:space="preserve">        index = mid</w:t>
+      </w:r>
+    </w:p>
+    <w:p>
+      <w:pPr>
+        <w:keepLines/>
+        <w:shd w:val="clear" w:color="auto" w:fill="F2F2F2"/>
+        <w:spacing w:before="0" w:after="0" w:line="240" w:lineRule="auto"/>
+        <w:ind w:left="240"/>
+      </w:pPr>
+      <w:r>
+        <w:rPr>
+          <w:rFonts w:ascii="Consolas" w:hAnsi="Consolas" w:cs="Consolas"/>
+          <w:sz w:val="19"/>
+        </w:rPr>
+        <w:t xml:space="preserve">        break</w:t>
+      </w:r>
+    </w:p>
+    <w:p>
+      <w:pPr>
+        <w:keepLines/>
+        <w:shd w:val="clear" w:color="auto" w:fill="F2F2F2"/>
+        <w:spacing w:before="0" w:after="0" w:line="240" w:lineRule="auto"/>
+        <w:ind w:left="240"/>
+      </w:pPr>
+      <w:r>
+        <w:rPr>
+          <w:rFonts w:ascii="Consolas" w:hAnsi="Consolas" w:cs="Consolas"/>
+          <w:sz w:val="19"/>
+        </w:rPr>
+        <w:t xml:space="preserve">    elif target &lt; array[mid]:</w:t>
+      </w:r>
+    </w:p>
+    <w:p>
+      <w:pPr>
+        <w:keepLines/>
+        <w:shd w:val="clear" w:color="auto" w:fill="F2F2F2"/>
+        <w:spacing w:before="0" w:after="0" w:line="240" w:lineRule="auto"/>
+        <w:ind w:left="240"/>
+      </w:pPr>
+      <w:r>
+        <w:rPr>
+          <w:rFonts w:ascii="Consolas" w:hAnsi="Consolas" w:cs="Consolas"/>
+          <w:sz w:val="19"/>
+        </w:rPr>
+        <w:t xml:space="preserve">        high = mid - 1</w:t>
+      </w:r>
+    </w:p>
+    <w:p>
+      <w:pPr>
+        <w:keepLines/>
+        <w:shd w:val="clear" w:color="auto" w:fill="F2F2F2"/>
+        <w:spacing w:before="0" w:after="0" w:line="240" w:lineRule="auto"/>
+        <w:ind w:left="240"/>
+      </w:pPr>
+      <w:r>
+        <w:rPr>
+          <w:rFonts w:ascii="Consolas" w:hAnsi="Consolas" w:cs="Consolas"/>
+          <w:sz w:val="19"/>
+        </w:rPr>
+        <w:t xml:space="preserve">    else:</w:t>
+      </w:r>
+    </w:p>
+    <w:p>
+      <w:pPr>
+        <w:keepLines/>
+        <w:shd w:val="clear" w:color="auto" w:fill="F2F2F2"/>
+        <w:spacing w:before="0" w:after="0" w:line="240" w:lineRule="auto"/>
+        <w:ind w:left="240"/>
+      </w:pPr>
+      <w:r>
+        <w:rPr>
+          <w:rFonts w:ascii="Consolas" w:hAnsi="Consolas" w:cs="Consolas"/>
+          <w:sz w:val="19"/>
+        </w:rPr>
+        <w:t xml:space="preserve">        low = mid + 1</w:t>
+      </w:r>
+    </w:p>
+    <w:p>
+      <w:pPr>
+        <w:keepLines/>
+        <w:shd w:val="clear" w:color="auto" w:fill="F2F2F2"/>
+        <w:spacing w:before="0" w:after="120" w:line="240" w:lineRule="auto"/>
+        <w:ind w:left="240"/>
+      </w:pPr>
+      <w:r>
+        <w:rPr>
+          <w:rFonts w:ascii="Consolas" w:hAnsi="Consolas" w:cs="Consolas"/>
+          <w:sz w:val="19"/>
+        </w:rPr>
+        <w:t xml:space="preserve">print(f"Position: {index + 1}")</w:t>
       </w:r>
     </w:p>
     <w:p>
@@ -879,14 +1215,90 @@
       </w:r>
     </w:p>
     <w:p>
+      <w:pPr>
+        <w:keepNext/>
+        <w:spacing w:after="40"/>
+      </w:pPr>
       <w:r>
         <w:rPr>
           <w:b/>
         </w:rPr>
-        <w:t xml:space="preserve">Operation: </w:t>
+        <w:t xml:space="preserve">Operation (Python code):</w:t>
       </w:r>
+    </w:p>
+    <w:p>
+      <w:pPr>
+        <w:keepLines/>
+        <w:shd w:val="clear" w:color="auto" w:fill="F2F2F2"/>
+        <w:spacing w:before="0" w:after="0" w:line="240" w:lineRule="auto"/>
+        <w:ind w:left="240"/>
+      </w:pPr>
       <w:r>
-        <w:t>Year + 1 → divisible by 4? → century rule → if True then "Leap Year" else "Common Year" → format as Next year: &lt;answer&gt;</w:t>
+        <w:rPr>
+          <w:rFonts w:ascii="Consolas" w:hAnsi="Consolas" w:cs="Consolas"/>
+          <w:sz w:val="19"/>
+        </w:rPr>
+        <w:t xml:space="preserve">year = 1999</w:t>
+      </w:r>
+    </w:p>
+    <w:p>
+      <w:pPr>
+        <w:keepLines/>
+        <w:shd w:val="clear" w:color="auto" w:fill="F2F2F2"/>
+        <w:spacing w:before="0" w:after="0" w:line="240" w:lineRule="auto"/>
+        <w:ind w:left="240"/>
+      </w:pPr>
+      <w:r>
+        <w:rPr>
+          <w:rFonts w:ascii="Consolas" w:hAnsi="Consolas" w:cs="Consolas"/>
+          <w:sz w:val="19"/>
+        </w:rPr>
+        <w:t xml:space="preserve">year = year + 1</w:t>
+      </w:r>
+    </w:p>
+    <w:p>
+      <w:pPr>
+        <w:keepLines/>
+        <w:shd w:val="clear" w:color="auto" w:fill="F2F2F2"/>
+        <w:spacing w:before="0" w:after="0" w:line="240" w:lineRule="auto"/>
+        <w:ind w:left="240"/>
+      </w:pPr>
+      <w:r>
+        <w:rPr>
+          <w:rFonts w:ascii="Consolas" w:hAnsi="Consolas" w:cs="Consolas"/>
+          <w:sz w:val="19"/>
+        </w:rPr>
+        <w:t xml:space="preserve">leap = year % 4 == 0 and (year % 100 != 0 or year % 400 == 0)</w:t>
+      </w:r>
+    </w:p>
+    <w:p>
+      <w:pPr>
+        <w:keepLines/>
+        <w:shd w:val="clear" w:color="auto" w:fill="F2F2F2"/>
+        <w:spacing w:before="0" w:after="0" w:line="240" w:lineRule="auto"/>
+        <w:ind w:left="240"/>
+      </w:pPr>
+      <w:r>
+        <w:rPr>
+          <w:rFonts w:ascii="Consolas" w:hAnsi="Consolas" w:cs="Consolas"/>
+          <w:sz w:val="19"/>
+        </w:rPr>
+        <w:t xml:space="preserve">answer = "Leap Year" if leap else "Common Year"</w:t>
+      </w:r>
+    </w:p>
+    <w:p>
+      <w:pPr>
+        <w:keepLines/>
+        <w:shd w:val="clear" w:color="auto" w:fill="F2F2F2"/>
+        <w:spacing w:before="0" w:after="120" w:line="240" w:lineRule="auto"/>
+        <w:ind w:left="240"/>
+      </w:pPr>
+      <w:r>
+        <w:rPr>
+          <w:rFonts w:ascii="Consolas" w:hAnsi="Consolas" w:cs="Consolas"/>
+          <w:sz w:val="19"/>
+        </w:rPr>
+        <w:t xml:space="preserve">print(f"Next year: {answer}")</w:t>
       </w:r>
     </w:p>
     <w:p>
@@ -1025,14 +1437,165 @@
       </w:r>
     </w:p>
     <w:p>
+      <w:pPr>
+        <w:keepNext/>
+        <w:spacing w:after="40"/>
+      </w:pPr>
       <w:r>
         <w:rPr>
           <w:b/>
         </w:rPr>
-        <w:t xml:space="preserve">Operation: </w:t>
+        <w:t xml:space="preserve">Operation (Python code):</w:t>
       </w:r>
+    </w:p>
+    <w:p>
+      <w:pPr>
+        <w:keepLines/>
+        <w:shd w:val="clear" w:color="auto" w:fill="F2F2F2"/>
+        <w:spacing w:before="0" w:after="0" w:line="240" w:lineRule="auto"/>
+        <w:ind w:left="240"/>
+      </w:pPr>
       <w:r>
-        <w:t>Keep marks between 10 and 100 → bubble sort (compare &amp; swap, repeat) → format as Sorted marks: &lt;list&gt;</w:t>
+        <w:rPr>
+          <w:rFonts w:ascii="Consolas" w:hAnsi="Consolas" w:cs="Consolas"/>
+          <w:sz w:val="19"/>
+        </w:rPr>
+        <w:t xml:space="preserve">marks = [64, 150, 25, 12, 5, 22, 11, 90]</w:t>
+      </w:r>
+    </w:p>
+    <w:p>
+      <w:pPr>
+        <w:keepLines/>
+        <w:shd w:val="clear" w:color="auto" w:fill="F2F2F2"/>
+        <w:spacing w:before="0" w:after="0" w:line="240" w:lineRule="auto"/>
+        <w:ind w:left="240"/>
+      </w:pPr>
+      <w:r>
+        <w:rPr>
+          <w:rFonts w:ascii="Consolas" w:hAnsi="Consolas" w:cs="Consolas"/>
+          <w:sz w:val="19"/>
+        </w:rPr>
+        <w:t xml:space="preserve">valid = [m for m in marks if 10 &lt;= m &lt;= 100]</w:t>
+      </w:r>
+    </w:p>
+    <w:p>
+      <w:pPr>
+        <w:keepLines/>
+        <w:shd w:val="clear" w:color="auto" w:fill="F2F2F2"/>
+        <w:spacing w:before="0" w:after="0" w:line="240" w:lineRule="auto"/>
+        <w:ind w:left="240"/>
+      </w:pPr>
+      <w:r>
+        <w:rPr>
+          <w:rFonts w:ascii="Consolas" w:hAnsi="Consolas" w:cs="Consolas"/>
+          <w:sz w:val="19"/>
+        </w:rPr>
+        <w:t xml:space="preserve">swapped = True</w:t>
+      </w:r>
+    </w:p>
+    <w:p>
+      <w:pPr>
+        <w:keepLines/>
+        <w:shd w:val="clear" w:color="auto" w:fill="F2F2F2"/>
+        <w:spacing w:before="0" w:after="0" w:line="240" w:lineRule="auto"/>
+        <w:ind w:left="240"/>
+      </w:pPr>
+      <w:r>
+        <w:rPr>
+          <w:rFonts w:ascii="Consolas" w:hAnsi="Consolas" w:cs="Consolas"/>
+          <w:sz w:val="19"/>
+        </w:rPr>
+        <w:t xml:space="preserve">while swapped:</w:t>
+      </w:r>
+    </w:p>
+    <w:p>
+      <w:pPr>
+        <w:keepLines/>
+        <w:shd w:val="clear" w:color="auto" w:fill="F2F2F2"/>
+        <w:spacing w:before="0" w:after="0" w:line="240" w:lineRule="auto"/>
+        <w:ind w:left="240"/>
+      </w:pPr>
+      <w:r>
+        <w:rPr>
+          <w:rFonts w:ascii="Consolas" w:hAnsi="Consolas" w:cs="Consolas"/>
+          <w:sz w:val="19"/>
+        </w:rPr>
+        <w:t xml:space="preserve">    swapped = False</w:t>
+      </w:r>
+    </w:p>
+    <w:p>
+      <w:pPr>
+        <w:keepLines/>
+        <w:shd w:val="clear" w:color="auto" w:fill="F2F2F2"/>
+        <w:spacing w:before="0" w:after="0" w:line="240" w:lineRule="auto"/>
+        <w:ind w:left="240"/>
+      </w:pPr>
+      <w:r>
+        <w:rPr>
+          <w:rFonts w:ascii="Consolas" w:hAnsi="Consolas" w:cs="Consolas"/>
+          <w:sz w:val="19"/>
+        </w:rPr>
+        <w:t xml:space="preserve">    for i in range(len(valid) - 1):</w:t>
+      </w:r>
+    </w:p>
+    <w:p>
+      <w:pPr>
+        <w:keepLines/>
+        <w:shd w:val="clear" w:color="auto" w:fill="F2F2F2"/>
+        <w:spacing w:before="0" w:after="0" w:line="240" w:lineRule="auto"/>
+        <w:ind w:left="240"/>
+      </w:pPr>
+      <w:r>
+        <w:rPr>
+          <w:rFonts w:ascii="Consolas" w:hAnsi="Consolas" w:cs="Consolas"/>
+          <w:sz w:val="19"/>
+        </w:rPr>
+        <w:t xml:space="preserve">        if valid[i] &gt; valid[i + 1]:</w:t>
+      </w:r>
+    </w:p>
+    <w:p>
+      <w:pPr>
+        <w:keepLines/>
+        <w:shd w:val="clear" w:color="auto" w:fill="F2F2F2"/>
+        <w:spacing w:before="0" w:after="0" w:line="240" w:lineRule="auto"/>
+        <w:ind w:left="240"/>
+      </w:pPr>
+      <w:r>
+        <w:rPr>
+          <w:rFonts w:ascii="Consolas" w:hAnsi="Consolas" w:cs="Consolas"/>
+          <w:sz w:val="19"/>
+        </w:rPr>
+        <w:t xml:space="preserve">            valid[i], valid[i + 1] = valid[i + 1], valid[i]</w:t>
+      </w:r>
+    </w:p>
+    <w:p>
+      <w:pPr>
+        <w:keepLines/>
+        <w:shd w:val="clear" w:color="auto" w:fill="F2F2F2"/>
+        <w:spacing w:before="0" w:after="0" w:line="240" w:lineRule="auto"/>
+        <w:ind w:left="240"/>
+      </w:pPr>
+      <w:r>
+        <w:rPr>
+          <w:rFonts w:ascii="Consolas" w:hAnsi="Consolas" w:cs="Consolas"/>
+          <w:sz w:val="19"/>
+        </w:rPr>
+        <w:t xml:space="preserve">            swapped = True</w:t>
+      </w:r>
+    </w:p>
+    <w:p>
+      <w:pPr>
+        <w:keepLines/>
+        <w:shd w:val="clear" w:color="auto" w:fill="F2F2F2"/>
+        <w:spacing w:before="0" w:after="120" w:line="240" w:lineRule="auto"/>
+        <w:ind w:left="240"/>
+      </w:pPr>
+      <w:r>
+        <w:rPr>
+          <w:rFonts w:ascii="Consolas" w:hAnsi="Consolas" w:cs="Consolas"/>
+          <w:sz w:val="19"/>
+        </w:rPr>
+        <w:t xml:space="preserve">print(f"Sorted marks: {valid}")</w:t>
       </w:r>
     </w:p>
     <w:p>
@@ -1171,14 +1734,131 @@
       </w:r>
     </w:p>
     <w:p>
+      <w:pPr>
+        <w:keepNext/>
+        <w:spacing w:after="40"/>
+      </w:pPr>
       <w:r>
         <w:rPr>
           <w:b/>
         </w:rPr>
-        <w:t xml:space="preserve">Operation: </w:t>
+        <w:t xml:space="preserve">Operation (structured):</w:t>
       </w:r>
+    </w:p>
+    <w:p>
+      <w:pPr>
+        <w:spacing w:before="0" w:after="0"/>
+        <w:ind w:left="240"/>
+      </w:pPr>
       <w:r>
-        <w:t>Add Savings = 6000 → total = sum of all amounts → percentage = amount ÷ total × 100 → pie chart with the title typed in</w:t>
+        <w:rPr>
+          <w:b/>
+        </w:rPr>
+        <w:t xml:space="preserve">INPUT</w:t>
+      </w:r>
+    </w:p>
+    <w:p>
+      <w:pPr>
+        <w:spacing w:before="0" w:after="0"/>
+        <w:ind w:left="460"/>
+      </w:pPr>
+      <w:r>
+        <w:rPr/>
+        <w:t xml:space="preserve">Expenses by category: Rent, Food, Transport, Entertainment</w:t>
+      </w:r>
+    </w:p>
+    <w:p>
+      <w:pPr>
+        <w:spacing w:before="0" w:after="0"/>
+        <w:ind w:left="240"/>
+      </w:pPr>
+      <w:r>
+        <w:rPr/>
+        <w:t xml:space="preserve"/>
+      </w:r>
+    </w:p>
+    <w:p>
+      <w:pPr>
+        <w:spacing w:before="0" w:after="0"/>
+        <w:ind w:left="240"/>
+      </w:pPr>
+      <w:r>
+        <w:rPr>
+          <w:b/>
+        </w:rPr>
+        <w:t xml:space="preserve">PROCESS</w:t>
+      </w:r>
+    </w:p>
+    <w:p>
+      <w:pPr>
+        <w:spacing w:before="0" w:after="0"/>
+        <w:ind w:left="460"/>
+      </w:pPr>
+      <w:r>
+        <w:rPr/>
+        <w:t xml:space="preserve">1. Add a 5th category: Savings = 6000</w:t>
+      </w:r>
+    </w:p>
+    <w:p>
+      <w:pPr>
+        <w:spacing w:before="0" w:after="0"/>
+        <w:ind w:left="460"/>
+      </w:pPr>
+      <w:r>
+        <w:rPr/>
+        <w:t xml:space="preserve">2. Total = sum of all 5 amounts</w:t>
+      </w:r>
+    </w:p>
+    <w:p>
+      <w:pPr>
+        <w:spacing w:before="0" w:after="0"/>
+        <w:ind w:left="460"/>
+      </w:pPr>
+      <w:r>
+        <w:rPr/>
+        <w:t xml:space="preserve">3. Percent of each category = amount / total x 100</w:t>
+      </w:r>
+    </w:p>
+    <w:p>
+      <w:pPr>
+        <w:spacing w:before="0" w:after="0"/>
+        <w:ind w:left="240"/>
+      </w:pPr>
+      <w:r>
+        <w:rPr/>
+        <w:t xml:space="preserve"/>
+      </w:r>
+    </w:p>
+    <w:p>
+      <w:pPr>
+        <w:spacing w:before="0" w:after="0"/>
+        <w:ind w:left="240"/>
+      </w:pPr>
+      <w:r>
+        <w:rPr>
+          <w:b/>
+        </w:rPr>
+        <w:t xml:space="preserve">OUTPUT</w:t>
+      </w:r>
+    </w:p>
+    <w:p>
+      <w:pPr>
+        <w:spacing w:before="0" w:after="0"/>
+        <w:ind w:left="460"/>
+      </w:pPr>
+      <w:r>
+        <w:rPr/>
+        <w:t xml:space="preserve">Pie chart titled "Monthly Budget Pie Chart"</w:t>
+      </w:r>
+    </w:p>
+    <w:p>
+      <w:pPr>
+        <w:spacing w:before="0" w:after="120"/>
+        <w:ind w:left="460"/>
+      </w:pPr>
+      <w:r>
+        <w:rPr/>
+        <w:t xml:space="preserve">Result: Category: percent | Category: percent | ...</w:t>
       </w:r>
     </w:p>
     <w:p>
@@ -1317,14 +1997,131 @@
       </w:r>
     </w:p>
     <w:p>
+      <w:pPr>
+        <w:keepNext/>
+        <w:spacing w:after="40"/>
+      </w:pPr>
       <w:r>
         <w:rPr>
           <w:b/>
         </w:rPr>
-        <w:t xml:space="preserve">Operation: </w:t>
+        <w:t xml:space="preserve">Operation (structured):</w:t>
       </w:r>
+    </w:p>
+    <w:p>
+      <w:pPr>
+        <w:spacing w:before="0" w:after="0"/>
+        <w:ind w:left="240"/>
+      </w:pPr>
       <w:r>
-        <w:t>Set target = 200 → each day: sales ≥ target → Above Target, otherwise Below Target → bar chart with the title and Y label typed in</w:t>
+        <w:rPr>
+          <w:b/>
+        </w:rPr>
+        <w:t xml:space="preserve">INPUT</w:t>
+      </w:r>
+    </w:p>
+    <w:p>
+      <w:pPr>
+        <w:spacing w:before="0" w:after="0"/>
+        <w:ind w:left="460"/>
+      </w:pPr>
+      <w:r>
+        <w:rPr/>
+        <w:t xml:space="preserve">Daily sales for 7 days (Mon-Sun)</w:t>
+      </w:r>
+    </w:p>
+    <w:p>
+      <w:pPr>
+        <w:spacing w:before="0" w:after="0"/>
+        <w:ind w:left="240"/>
+      </w:pPr>
+      <w:r>
+        <w:rPr/>
+        <w:t xml:space="preserve"/>
+      </w:r>
+    </w:p>
+    <w:p>
+      <w:pPr>
+        <w:spacing w:before="0" w:after="0"/>
+        <w:ind w:left="240"/>
+      </w:pPr>
+      <w:r>
+        <w:rPr>
+          <w:b/>
+        </w:rPr>
+        <w:t xml:space="preserve">PROCESS</w:t>
+      </w:r>
+    </w:p>
+    <w:p>
+      <w:pPr>
+        <w:spacing w:before="0" w:after="0"/>
+        <w:ind w:left="460"/>
+      </w:pPr>
+      <w:r>
+        <w:rPr/>
+        <w:t xml:space="preserve">1. Set the target = 200</w:t>
+      </w:r>
+    </w:p>
+    <w:p>
+      <w:pPr>
+        <w:spacing w:before="0" w:after="0"/>
+        <w:ind w:left="460"/>
+      </w:pPr>
+      <w:r>
+        <w:rPr/>
+        <w:t xml:space="preserve">2. For each day: sales &gt;= target -&gt; "Above Target", else "Below Target"</w:t>
+      </w:r>
+    </w:p>
+    <w:p>
+      <w:pPr>
+        <w:spacing w:before="0" w:after="0"/>
+        <w:ind w:left="240"/>
+      </w:pPr>
+      <w:r>
+        <w:rPr/>
+        <w:t xml:space="preserve"/>
+      </w:r>
+    </w:p>
+    <w:p>
+      <w:pPr>
+        <w:spacing w:before="0" w:after="0"/>
+        <w:ind w:left="240"/>
+      </w:pPr>
+      <w:r>
+        <w:rPr>
+          <w:b/>
+        </w:rPr>
+        <w:t xml:space="preserve">OUTPUT</w:t>
+      </w:r>
+    </w:p>
+    <w:p>
+      <w:pPr>
+        <w:spacing w:before="0" w:after="0"/>
+        <w:ind w:left="460"/>
+      </w:pPr>
+      <w:r>
+        <w:rPr/>
+        <w:t xml:space="preserve">Bar chart titled "Weekly Sales Bar Chart", Y label "Sales ($)"</w:t>
+      </w:r>
+    </w:p>
+    <w:p>
+      <w:pPr>
+        <w:spacing w:before="0" w:after="0"/>
+        <w:ind w:left="460"/>
+      </w:pPr>
+      <w:r>
+        <w:rPr/>
+        <w:t xml:space="preserve">(green = Above Target, red = Below Target)</w:t>
+      </w:r>
+    </w:p>
+    <w:p>
+      <w:pPr>
+        <w:spacing w:before="0" w:after="120"/>
+        <w:ind w:left="460"/>
+      </w:pPr>
+      <w:r>
+        <w:rPr/>
+        <w:t xml:space="preserve">Result: Day: status | Day: status | ...</w:t>
       </w:r>
     </w:p>
     <w:p>

</xml_diff>